<commit_message>
modify 1~7 add 8,9
</commit_message>
<xml_diff>
--- a/main/长风镇边关--4.docx
+++ b/main/长风镇边关--4.docx
@@ -24,6 +24,8 @@
           <w:szCs w:val="21"/>
         </w:rPr>
       </w:pPr>
+      <w:bookmarkStart w:id="0" w:name="_GoBack"/>
+      <w:bookmarkEnd w:id="0"/>
       <w:r>
         <w:rPr>
           <w:rFonts w:hint="default" w:asciiTheme="minorAscii" w:hAnsiTheme="minorAscii"/>
@@ -74,8 +76,6 @@
         </w:rPr>
         <w:t>上</w:t>
       </w:r>
-      <w:bookmarkStart w:id="0" w:name="_GoBack"/>
-      <w:bookmarkEnd w:id="0"/>
       <w:r>
         <w:rPr>
           <w:rFonts w:hint="eastAsia" w:asciiTheme="minorAscii" w:hAnsiTheme="minorAscii"/>

</xml_diff>